<commit_message>
Fix Devin Review issues in annual projection: cohort location inference, zero-transition Laplace grid, dropout-preserving matrix, full-grid evaluation, and reproducible zip/pptx
Co-Authored-By: Tatsuki Onishi <bougtoir@gmail.com>
</commit_message>
<xml_diff>
--- a/researcher_mobility_ode/docs/annual_rates_projection_report.docx
+++ b/researcher_mobility_ode/docs/annual_rates_projection_report.docx
@@ -271,7 +271,7 @@
           </w:tcPr>
           <w:p>
             <w:r>
-              <w:t>2.48</w:t>
+              <w:t>1.79</w:t>
             </w:r>
           </w:p>
         </w:tc>
@@ -281,7 +281,7 @@
           </w:tcPr>
           <w:p>
             <w:r>
-              <w:t>28.86%</w:t>
+              <w:t>24.50%</w:t>
             </w:r>
           </w:p>
         </w:tc>
@@ -303,7 +303,7 @@
           </w:tcPr>
           <w:p>
             <w:r>
-              <w:t>3.56</w:t>
+              <w:t>2.12</w:t>
             </w:r>
           </w:p>
         </w:tc>
@@ -313,7 +313,7 @@
           </w:tcPr>
           <w:p>
             <w:r>
-              <w:t>46.58%</w:t>
+              <w:t>28.52%</w:t>
             </w:r>
           </w:p>
         </w:tc>
@@ -335,7 +335,7 @@
           </w:tcPr>
           <w:p>
             <w:r>
-              <w:t>2.51</w:t>
+              <w:t>1.56</w:t>
             </w:r>
           </w:p>
         </w:tc>
@@ -345,7 +345,7 @@
           </w:tcPr>
           <w:p>
             <w:r>
-              <w:t>37.78%</w:t>
+              <w:t>30.49%</w:t>
             </w:r>
           </w:p>
         </w:tc>
@@ -367,7 +367,7 @@
           </w:tcPr>
           <w:p>
             <w:r>
-              <w:t>3.47</w:t>
+              <w:t>3.05</w:t>
             </w:r>
           </w:p>
         </w:tc>
@@ -377,7 +377,7 @@
           </w:tcPr>
           <w:p>
             <w:r>
-              <w:t>41.54%</w:t>
+              <w:t>47.97%</w:t>
             </w:r>
           </w:p>
         </w:tc>
@@ -399,7 +399,7 @@
           </w:tcPr>
           <w:p>
             <w:r>
-              <w:t>1.90</w:t>
+              <w:t>1.23</w:t>
             </w:r>
           </w:p>
         </w:tc>
@@ -409,7 +409,7 @@
           </w:tcPr>
           <w:p>
             <w:r>
-              <w:t>30.16%</w:t>
+              <w:t>32.29%</w:t>
             </w:r>
           </w:p>
         </w:tc>
@@ -431,7 +431,7 @@
           </w:tcPr>
           <w:p>
             <w:r>
-              <w:t>2.99</w:t>
+              <w:t>1.72</w:t>
             </w:r>
           </w:p>
         </w:tc>
@@ -441,7 +441,7 @@
           </w:tcPr>
           <w:p>
             <w:r>
-              <w:t>42.09%</w:t>
+              <w:t>36.68%</w:t>
             </w:r>
           </w:p>
         </w:tc>
@@ -463,7 +463,7 @@
           </w:tcPr>
           <w:p>
             <w:r>
-              <w:t>3.05</w:t>
+              <w:t>2.22</w:t>
             </w:r>
           </w:p>
         </w:tc>
@@ -473,7 +473,7 @@
           </w:tcPr>
           <w:p>
             <w:r>
-              <w:t>36.87%</w:t>
+              <w:t>34.84%</w:t>
             </w:r>
           </w:p>
         </w:tc>
@@ -495,7 +495,7 @@
           </w:tcPr>
           <w:p>
             <w:r>
-              <w:t>2.43</w:t>
+              <w:t>4.43</w:t>
             </w:r>
           </w:p>
         </w:tc>
@@ -505,7 +505,7 @@
           </w:tcPr>
           <w:p>
             <w:r>
-              <w:t>26.23%</w:t>
+              <w:t>54.51%</w:t>
             </w:r>
           </w:p>
         </w:tc>
@@ -527,7 +527,7 @@
           </w:tcPr>
           <w:p>
             <w:r>
-              <w:t>4.01</w:t>
+              <w:t>3.87</w:t>
             </w:r>
           </w:p>
         </w:tc>
@@ -537,7 +537,7 @@
           </w:tcPr>
           <w:p>
             <w:r>
-              <w:t>29.05%</w:t>
+              <w:t>33.59%</w:t>
             </w:r>
           </w:p>
         </w:tc>
@@ -612,7 +612,7 @@
           </w:tcPr>
           <w:p>
             <w:r>
-              <w:t>1.45</w:t>
+              <w:t>0.86</w:t>
             </w:r>
           </w:p>
         </w:tc>
@@ -622,7 +622,7 @@
           </w:tcPr>
           <w:p>
             <w:r>
-              <w:t>53.34%</w:t>
+              <w:t>55.01%</w:t>
             </w:r>
           </w:p>
         </w:tc>
@@ -644,7 +644,7 @@
           </w:tcPr>
           <w:p>
             <w:r>
-              <w:t>2.12</w:t>
+              <w:t>1.51</w:t>
             </w:r>
           </w:p>
         </w:tc>
@@ -654,7 +654,7 @@
           </w:tcPr>
           <w:p>
             <w:r>
-              <w:t>26.90%</w:t>
+              <w:t>21.09%</w:t>
             </w:r>
           </w:p>
         </w:tc>
@@ -676,7 +676,7 @@
           </w:tcPr>
           <w:p>
             <w:r>
-              <w:t>1.37</w:t>
+              <w:t>1.52</w:t>
             </w:r>
           </w:p>
         </w:tc>
@@ -686,7 +686,7 @@
           </w:tcPr>
           <w:p>
             <w:r>
-              <w:t>28.19%</w:t>
+              <w:t>27.61%</w:t>
             </w:r>
           </w:p>
         </w:tc>
@@ -708,7 +708,7 @@
           </w:tcPr>
           <w:p>
             <w:r>
-              <w:t>4.36</w:t>
+              <w:t>4.68</w:t>
             </w:r>
           </w:p>
         </w:tc>
@@ -718,7 +718,7 @@
           </w:tcPr>
           <w:p>
             <w:r>
-              <w:t>25.05%</w:t>
+              <w:t>32.25%</w:t>
             </w:r>
           </w:p>
         </w:tc>
@@ -740,7 +740,7 @@
           </w:tcPr>
           <w:p>
             <w:r>
-              <w:t>2.42</w:t>
+              <w:t>1.99</w:t>
             </w:r>
           </w:p>
         </w:tc>
@@ -750,7 +750,7 @@
           </w:tcPr>
           <w:p>
             <w:r>
-              <w:t>41.74%</w:t>
+              <w:t>46.91%</w:t>
             </w:r>
           </w:p>
         </w:tc>
@@ -772,7 +772,7 @@
           </w:tcPr>
           <w:p>
             <w:r>
-              <w:t>3.90</w:t>
+              <w:t>3.33</w:t>
             </w:r>
           </w:p>
         </w:tc>
@@ -782,7 +782,7 @@
           </w:tcPr>
           <w:p>
             <w:r>
-              <w:t>47.60%</w:t>
+              <w:t>32.72%</w:t>
             </w:r>
           </w:p>
         </w:tc>
@@ -799,7 +799,7 @@
     </w:p>
     <w:p>
       <w:r>
-        <w:t>Overall RMSE = 3.04, MAPE = 35.13%. Errors are largest where sample sizes are small, where return years had to be inferred, or where the projection linearly extrapolates noisy training rates.</w:t>
+        <w:t>Overall RMSE = 2.66, MAPE = 35.93%. Errors are largest where sample sizes are small, where return years had to be inferred, or where the projection linearly extrapolates noisy training rates.</w:t>
       </w:r>
     </w:p>
     <w:p>

</xml_diff>

<commit_message>
fix(annual-projection): right-censor exits, fill zero-inflow years, train-period first-compartment shares, dashed/solid observed/projected split, pass fig_dir to annual plots; correct Methods text to match code; regenerate full-article docx/md/pptx/zip and review report
Co-Authored-By: Tatsuki Onishi <bougtoir@gmail.com>
</commit_message>
<xml_diff>
--- a/researcher_mobility_ode/docs/annual_rates_projection_report.docx
+++ b/researcher_mobility_ode/docs/annual_rates_projection_report.docx
@@ -170,7 +170,7 @@
       <w:r>
         <w:drawing>
           <wp:inline xmlns:a="http://schemas.openxmlformats.org/drawingml/2006/main" xmlns:pic="http://schemas.openxmlformats.org/drawingml/2006/picture">
-            <wp:extent cx="5943600" cy="3791693"/>
+            <wp:extent cx="5943600" cy="3792488"/>
             <wp:docPr id="3" name="Picture 3"/>
             <wp:cNvGraphicFramePr>
               <a:graphicFrameLocks noChangeAspect="1"/>
@@ -191,7 +191,7 @@
                   <pic:spPr>
                     <a:xfrm>
                       <a:off x="0" y="0"/>
-                      <a:ext cx="5943600" cy="3791693"/>
+                      <a:ext cx="5943600" cy="3792488"/>
                     </a:xfrm>
                     <a:prstGeom prst="rect"/>
                   </pic:spPr>
@@ -271,7 +271,7 @@
           </w:tcPr>
           <w:p>
             <w:r>
-              <w:t>1.79</w:t>
+              <w:t>1.77</w:t>
             </w:r>
           </w:p>
         </w:tc>
@@ -281,7 +281,7 @@
           </w:tcPr>
           <w:p>
             <w:r>
-              <w:t>24.50%</w:t>
+              <w:t>25.25%</w:t>
             </w:r>
           </w:p>
         </w:tc>
@@ -303,7 +303,7 @@
           </w:tcPr>
           <w:p>
             <w:r>
-              <w:t>2.12</w:t>
+              <w:t>1.97</w:t>
             </w:r>
           </w:p>
         </w:tc>
@@ -313,7 +313,7 @@
           </w:tcPr>
           <w:p>
             <w:r>
-              <w:t>28.52%</w:t>
+              <w:t>27.21%</w:t>
             </w:r>
           </w:p>
         </w:tc>
@@ -335,7 +335,7 @@
           </w:tcPr>
           <w:p>
             <w:r>
-              <w:t>1.56</w:t>
+              <w:t>2.44</w:t>
             </w:r>
           </w:p>
         </w:tc>
@@ -345,7 +345,7 @@
           </w:tcPr>
           <w:p>
             <w:r>
-              <w:t>30.49%</w:t>
+              <w:t>39.35%</w:t>
             </w:r>
           </w:p>
         </w:tc>
@@ -367,7 +367,7 @@
           </w:tcPr>
           <w:p>
             <w:r>
-              <w:t>3.05</w:t>
+              <w:t>4.99</w:t>
             </w:r>
           </w:p>
         </w:tc>
@@ -377,7 +377,7 @@
           </w:tcPr>
           <w:p>
             <w:r>
-              <w:t>47.97%</w:t>
+              <w:t>68.85%</w:t>
             </w:r>
           </w:p>
         </w:tc>
@@ -409,7 +409,7 @@
           </w:tcPr>
           <w:p>
             <w:r>
-              <w:t>32.29%</w:t>
+              <w:t>32.15%</w:t>
             </w:r>
           </w:p>
         </w:tc>
@@ -431,7 +431,7 @@
           </w:tcPr>
           <w:p>
             <w:r>
-              <w:t>1.72</w:t>
+              <w:t>1.83</w:t>
             </w:r>
           </w:p>
         </w:tc>
@@ -441,7 +441,7 @@
           </w:tcPr>
           <w:p>
             <w:r>
-              <w:t>36.68%</w:t>
+              <w:t>37.57%</w:t>
             </w:r>
           </w:p>
         </w:tc>
@@ -463,7 +463,7 @@
           </w:tcPr>
           <w:p>
             <w:r>
-              <w:t>2.22</w:t>
+              <w:t>2.74</w:t>
             </w:r>
           </w:p>
         </w:tc>
@@ -473,7 +473,7 @@
           </w:tcPr>
           <w:p>
             <w:r>
-              <w:t>34.84%</w:t>
+              <w:t>42.92%</w:t>
             </w:r>
           </w:p>
         </w:tc>
@@ -495,7 +495,7 @@
           </w:tcPr>
           <w:p>
             <w:r>
-              <w:t>4.43</w:t>
+              <w:t>5.30</w:t>
             </w:r>
           </w:p>
         </w:tc>
@@ -505,7 +505,7 @@
           </w:tcPr>
           <w:p>
             <w:r>
-              <w:t>54.51%</w:t>
+              <w:t>70.88%</w:t>
             </w:r>
           </w:p>
         </w:tc>
@@ -527,7 +527,7 @@
           </w:tcPr>
           <w:p>
             <w:r>
-              <w:t>3.87</w:t>
+              <w:t>4.79</w:t>
             </w:r>
           </w:p>
         </w:tc>
@@ -537,7 +537,7 @@
           </w:tcPr>
           <w:p>
             <w:r>
-              <w:t>33.59%</w:t>
+              <w:t>38.20%</w:t>
             </w:r>
           </w:p>
         </w:tc>
@@ -612,7 +612,7 @@
           </w:tcPr>
           <w:p>
             <w:r>
-              <w:t>0.86</w:t>
+              <w:t>1.15</w:t>
             </w:r>
           </w:p>
         </w:tc>
@@ -622,7 +622,7 @@
           </w:tcPr>
           <w:p>
             <w:r>
-              <w:t>55.01%</w:t>
+              <w:t>72.09%</w:t>
             </w:r>
           </w:p>
         </w:tc>
@@ -644,7 +644,7 @@
           </w:tcPr>
           <w:p>
             <w:r>
-              <w:t>1.51</w:t>
+              <w:t>2.42</w:t>
             </w:r>
           </w:p>
         </w:tc>
@@ -654,7 +654,7 @@
           </w:tcPr>
           <w:p>
             <w:r>
-              <w:t>21.09%</w:t>
+              <w:t>29.41%</w:t>
             </w:r>
           </w:p>
         </w:tc>
@@ -676,7 +676,7 @@
           </w:tcPr>
           <w:p>
             <w:r>
-              <w:t>1.52</w:t>
+              <w:t>1.63</w:t>
             </w:r>
           </w:p>
         </w:tc>
@@ -686,7 +686,7 @@
           </w:tcPr>
           <w:p>
             <w:r>
-              <w:t>27.61%</w:t>
+              <w:t>28.94%</w:t>
             </w:r>
           </w:p>
         </w:tc>
@@ -708,7 +708,7 @@
           </w:tcPr>
           <w:p>
             <w:r>
-              <w:t>4.68</w:t>
+              <w:t>6.54</w:t>
             </w:r>
           </w:p>
         </w:tc>
@@ -718,7 +718,7 @@
           </w:tcPr>
           <w:p>
             <w:r>
-              <w:t>32.25%</w:t>
+              <w:t>44.20%</w:t>
             </w:r>
           </w:p>
         </w:tc>
@@ -740,7 +740,7 @@
           </w:tcPr>
           <w:p>
             <w:r>
-              <w:t>1.99</w:t>
+              <w:t>1.98</w:t>
             </w:r>
           </w:p>
         </w:tc>
@@ -750,7 +750,7 @@
           </w:tcPr>
           <w:p>
             <w:r>
-              <w:t>46.91%</w:t>
+              <w:t>47.03%</w:t>
             </w:r>
           </w:p>
         </w:tc>
@@ -772,7 +772,7 @@
           </w:tcPr>
           <w:p>
             <w:r>
-              <w:t>3.33</w:t>
+              <w:t>3.32</w:t>
             </w:r>
           </w:p>
         </w:tc>
@@ -782,7 +782,7 @@
           </w:tcPr>
           <w:p>
             <w:r>
-              <w:t>32.72%</w:t>
+              <w:t>33.25%</w:t>
             </w:r>
           </w:p>
         </w:tc>
@@ -799,7 +799,7 @@
     </w:p>
     <w:p>
       <w:r>
-        <w:t>Overall RMSE = 2.66, MAPE = 35.93%. Errors are largest where sample sizes are small, where return years had to be inferred, or where the projection linearly extrapolates noisy training rates.</w:t>
+        <w:t>Overall RMSE = 3.35, MAPE = 42.49%. Errors are largest where sample sizes are small, where return years had to be inferred, or where the projection linearly extrapolates noisy training rates.</w:t>
       </w:r>
     </w:p>
     <w:p>

</xml_diff>

<commit_message>
regenerate: cohort with min-works=2 and PI without coauthor threshold; update results, figures and manuscripts
Co-Authored-By: Tatsuki Onishi <bougtoir@gmail.com>
</commit_message>
<xml_diff>
--- a/researcher_mobility_ode/docs/annual_rates_projection_report.docx
+++ b/researcher_mobility_ode/docs/annual_rates_projection_report.docx
@@ -170,7 +170,7 @@
       <w:r>
         <w:drawing>
           <wp:inline xmlns:a="http://schemas.openxmlformats.org/drawingml/2006/main" xmlns:pic="http://schemas.openxmlformats.org/drawingml/2006/picture">
-            <wp:extent cx="5943600" cy="3792488"/>
+            <wp:extent cx="5943600" cy="3791693"/>
             <wp:docPr id="3" name="Picture 3"/>
             <wp:cNvGraphicFramePr>
               <a:graphicFrameLocks noChangeAspect="1"/>
@@ -191,7 +191,7 @@
                   <pic:spPr>
                     <a:xfrm>
                       <a:off x="0" y="0"/>
-                      <a:ext cx="5943600" cy="3792488"/>
+                      <a:ext cx="5943600" cy="3791693"/>
                     </a:xfrm>
                     <a:prstGeom prst="rect"/>
                   </pic:spPr>
@@ -271,7 +271,7 @@
           </w:tcPr>
           <w:p>
             <w:r>
-              <w:t>1.77</w:t>
+              <w:t>1.80</w:t>
             </w:r>
           </w:p>
         </w:tc>
@@ -281,7 +281,7 @@
           </w:tcPr>
           <w:p>
             <w:r>
-              <w:t>25.25%</w:t>
+              <w:t>46.18%</w:t>
             </w:r>
           </w:p>
         </w:tc>
@@ -303,7 +303,7 @@
           </w:tcPr>
           <w:p>
             <w:r>
-              <w:t>1.97</w:t>
+              <w:t>2.94</w:t>
             </w:r>
           </w:p>
         </w:tc>
@@ -313,7 +313,7 @@
           </w:tcPr>
           <w:p>
             <w:r>
-              <w:t>27.21%</w:t>
+              <w:t>82.40%</w:t>
             </w:r>
           </w:p>
         </w:tc>
@@ -335,7 +335,7 @@
           </w:tcPr>
           <w:p>
             <w:r>
-              <w:t>2.44</w:t>
+              <w:t>5.93</w:t>
             </w:r>
           </w:p>
         </w:tc>
@@ -345,7 +345,7 @@
           </w:tcPr>
           <w:p>
             <w:r>
-              <w:t>39.35%</w:t>
+              <w:t>86.56%</w:t>
             </w:r>
           </w:p>
         </w:tc>
@@ -367,7 +367,7 @@
           </w:tcPr>
           <w:p>
             <w:r>
-              <w:t>4.99</w:t>
+              <w:t>6.39</w:t>
             </w:r>
           </w:p>
         </w:tc>
@@ -377,7 +377,7 @@
           </w:tcPr>
           <w:p>
             <w:r>
-              <w:t>68.85%</w:t>
+              <w:t>82.25%</w:t>
             </w:r>
           </w:p>
         </w:tc>
@@ -399,7 +399,7 @@
           </w:tcPr>
           <w:p>
             <w:r>
-              <w:t>1.23</w:t>
+              <w:t>1.64</w:t>
             </w:r>
           </w:p>
         </w:tc>
@@ -409,7 +409,7 @@
           </w:tcPr>
           <w:p>
             <w:r>
-              <w:t>32.15%</w:t>
+              <w:t>22.93%</w:t>
             </w:r>
           </w:p>
         </w:tc>
@@ -431,7 +431,7 @@
           </w:tcPr>
           <w:p>
             <w:r>
-              <w:t>1.83</w:t>
+              <w:t>2.62</w:t>
             </w:r>
           </w:p>
         </w:tc>
@@ -441,7 +441,7 @@
           </w:tcPr>
           <w:p>
             <w:r>
-              <w:t>37.57%</w:t>
+              <w:t>65.70%</w:t>
             </w:r>
           </w:p>
         </w:tc>
@@ -463,7 +463,7 @@
           </w:tcPr>
           <w:p>
             <w:r>
-              <w:t>2.74</w:t>
+              <w:t>2.57</w:t>
             </w:r>
           </w:p>
         </w:tc>
@@ -473,7 +473,7 @@
           </w:tcPr>
           <w:p>
             <w:r>
-              <w:t>42.92%</w:t>
+              <w:t>70.41%</w:t>
             </w:r>
           </w:p>
         </w:tc>
@@ -495,7 +495,7 @@
           </w:tcPr>
           <w:p>
             <w:r>
-              <w:t>5.30</w:t>
+              <w:t>3.66</w:t>
             </w:r>
           </w:p>
         </w:tc>
@@ -505,7 +505,7 @@
           </w:tcPr>
           <w:p>
             <w:r>
-              <w:t>70.88%</w:t>
+              <w:t>99.62%</w:t>
             </w:r>
           </w:p>
         </w:tc>
@@ -527,7 +527,7 @@
           </w:tcPr>
           <w:p>
             <w:r>
-              <w:t>4.79</w:t>
+              <w:t>4.85</w:t>
             </w:r>
           </w:p>
         </w:tc>
@@ -537,7 +537,7 @@
           </w:tcPr>
           <w:p>
             <w:r>
-              <w:t>38.20%</w:t>
+              <w:t>88.62%</w:t>
             </w:r>
           </w:p>
         </w:tc>
@@ -612,7 +612,7 @@
           </w:tcPr>
           <w:p>
             <w:r>
-              <w:t>1.15</w:t>
+              <w:t>1.80</w:t>
             </w:r>
           </w:p>
         </w:tc>
@@ -622,7 +622,7 @@
           </w:tcPr>
           <w:p>
             <w:r>
-              <w:t>72.09%</w:t>
+              <w:t>106.23%</w:t>
             </w:r>
           </w:p>
         </w:tc>
@@ -644,7 +644,7 @@
           </w:tcPr>
           <w:p>
             <w:r>
-              <w:t>2.42</w:t>
+              <w:t>5.40</w:t>
             </w:r>
           </w:p>
         </w:tc>
@@ -654,7 +654,7 @@
           </w:tcPr>
           <w:p>
             <w:r>
-              <w:t>29.41%</w:t>
+              <w:t>117.43%</w:t>
             </w:r>
           </w:p>
         </w:tc>
@@ -676,7 +676,7 @@
           </w:tcPr>
           <w:p>
             <w:r>
-              <w:t>1.63</w:t>
+              <w:t>0.78</w:t>
             </w:r>
           </w:p>
         </w:tc>
@@ -686,7 +686,7 @@
           </w:tcPr>
           <w:p>
             <w:r>
-              <w:t>28.94%</w:t>
+              <w:t>37.13%</w:t>
             </w:r>
           </w:p>
         </w:tc>
@@ -708,7 +708,7 @@
           </w:tcPr>
           <w:p>
             <w:r>
-              <w:t>6.54</w:t>
+              <w:t>3.45</w:t>
             </w:r>
           </w:p>
         </w:tc>
@@ -718,7 +718,7 @@
           </w:tcPr>
           <w:p>
             <w:r>
-              <w:t>44.20%</w:t>
+              <w:t>109.80%</w:t>
             </w:r>
           </w:p>
         </w:tc>
@@ -740,7 +740,7 @@
           </w:tcPr>
           <w:p>
             <w:r>
-              <w:t>1.98</w:t>
+              <w:t>2.57</w:t>
             </w:r>
           </w:p>
         </w:tc>
@@ -750,7 +750,7 @@
           </w:tcPr>
           <w:p>
             <w:r>
-              <w:t>47.03%</w:t>
+              <w:t>36.39%</w:t>
             </w:r>
           </w:p>
         </w:tc>
@@ -772,7 +772,7 @@
           </w:tcPr>
           <w:p>
             <w:r>
-              <w:t>3.32</w:t>
+              <w:t>6.51</w:t>
             </w:r>
           </w:p>
         </w:tc>
@@ -782,7 +782,7 @@
           </w:tcPr>
           <w:p>
             <w:r>
-              <w:t>33.25%</w:t>
+              <w:t>22.79%</w:t>
             </w:r>
           </w:p>
         </w:tc>
@@ -799,7 +799,7 @@
     </w:p>
     <w:p>
       <w:r>
-        <w:t>Overall RMSE = 3.35, MAPE = 42.49%. Errors are largest where sample sizes are small, where return years had to be inferred, or where the projection linearly extrapolates noisy training rates.</w:t>
+        <w:t>Overall RMSE = 3.96, MAPE = 71.63%. Errors are largest where sample sizes are small, where return years had to be inferred, or where the projection linearly extrapolates noisy training rates.</w:t>
       </w:r>
     </w:p>
     <w:p>

</xml_diff>

<commit_message>
feat: full AI/ML cohort extraction without max-authors cap (2426 authors) and API key support
- Remove max-authors cap; extract all 6,095 unique authors from the 1,800 sampled works.
- Add OPENALEX_API_KEY env support in openalex_client.py.
- Regenerate all results, figures, and manuscript from the expanded cohort.
- Manuscript now reflects 2,426 author cohort and updated PNR/projection metrics.

Co-Authored-By: Tatsuki Onishi <bougtoir@gmail.com>
</commit_message>
<xml_diff>
--- a/researcher_mobility_ode/docs/annual_rates_projection_report.docx
+++ b/researcher_mobility_ode/docs/annual_rates_projection_report.docx
@@ -99,7 +99,7 @@
       <w:r>
         <w:drawing>
           <wp:inline xmlns:a="http://schemas.openxmlformats.org/drawingml/2006/main" xmlns:pic="http://schemas.openxmlformats.org/drawingml/2006/picture">
-            <wp:extent cx="5029200" cy="4203722"/>
+            <wp:extent cx="5029200" cy="4164037"/>
             <wp:docPr id="2" name="Picture 2"/>
             <wp:cNvGraphicFramePr>
               <a:graphicFrameLocks noChangeAspect="1"/>
@@ -120,7 +120,7 @@
                   <pic:spPr>
                     <a:xfrm>
                       <a:off x="0" y="0"/>
-                      <a:ext cx="5029200" cy="4203722"/>
+                      <a:ext cx="5029200" cy="4164037"/>
                     </a:xfrm>
                     <a:prstGeom prst="rect"/>
                   </pic:spPr>
@@ -271,7 +271,7 @@
           </w:tcPr>
           <w:p>
             <w:r>
-              <w:t>1.80</w:t>
+              <w:t>6.32</w:t>
             </w:r>
           </w:p>
         </w:tc>
@@ -281,7 +281,7 @@
           </w:tcPr>
           <w:p>
             <w:r>
-              <w:t>46.18%</w:t>
+              <w:t>76.13%</w:t>
             </w:r>
           </w:p>
         </w:tc>
@@ -303,7 +303,7 @@
           </w:tcPr>
           <w:p>
             <w:r>
-              <w:t>2.94</w:t>
+              <w:t>29.90</w:t>
             </w:r>
           </w:p>
         </w:tc>
@@ -313,7 +313,7 @@
           </w:tcPr>
           <w:p>
             <w:r>
-              <w:t>82.40%</w:t>
+              <w:t>134.87%</w:t>
             </w:r>
           </w:p>
         </w:tc>
@@ -335,7 +335,7 @@
           </w:tcPr>
           <w:p>
             <w:r>
-              <w:t>5.93</w:t>
+              <w:t>49.35</w:t>
             </w:r>
           </w:p>
         </w:tc>
@@ -345,7 +345,7 @@
           </w:tcPr>
           <w:p>
             <w:r>
-              <w:t>86.56%</w:t>
+              <w:t>134.90%</w:t>
             </w:r>
           </w:p>
         </w:tc>
@@ -367,7 +367,7 @@
           </w:tcPr>
           <w:p>
             <w:r>
-              <w:t>6.39</w:t>
+              <w:t>47.47</w:t>
             </w:r>
           </w:p>
         </w:tc>
@@ -377,7 +377,7 @@
           </w:tcPr>
           <w:p>
             <w:r>
-              <w:t>82.25%</w:t>
+              <w:t>305.04%</w:t>
             </w:r>
           </w:p>
         </w:tc>
@@ -399,7 +399,7 @@
           </w:tcPr>
           <w:p>
             <w:r>
-              <w:t>1.64</w:t>
+              <w:t>15.79</w:t>
             </w:r>
           </w:p>
         </w:tc>
@@ -409,7 +409,7 @@
           </w:tcPr>
           <w:p>
             <w:r>
-              <w:t>22.93%</w:t>
+              <w:t>66.04%</w:t>
             </w:r>
           </w:p>
         </w:tc>
@@ -431,7 +431,7 @@
           </w:tcPr>
           <w:p>
             <w:r>
-              <w:t>2.62</w:t>
+              <w:t>24.85</w:t>
             </w:r>
           </w:p>
         </w:tc>
@@ -441,7 +441,7 @@
           </w:tcPr>
           <w:p>
             <w:r>
-              <w:t>65.70%</w:t>
+              <w:t>122.96%</w:t>
             </w:r>
           </w:p>
         </w:tc>
@@ -463,7 +463,7 @@
           </w:tcPr>
           <w:p>
             <w:r>
-              <w:t>2.57</w:t>
+              <w:t>11.31</w:t>
             </w:r>
           </w:p>
         </w:tc>
@@ -473,7 +473,7 @@
           </w:tcPr>
           <w:p>
             <w:r>
-              <w:t>70.41%</w:t>
+              <w:t>197.81%</w:t>
             </w:r>
           </w:p>
         </w:tc>
@@ -495,7 +495,7 @@
           </w:tcPr>
           <w:p>
             <w:r>
-              <w:t>3.66</w:t>
+              <w:t>23.92</w:t>
             </w:r>
           </w:p>
         </w:tc>
@@ -505,7 +505,7 @@
           </w:tcPr>
           <w:p>
             <w:r>
-              <w:t>99.62%</w:t>
+              <w:t>71.44%</w:t>
             </w:r>
           </w:p>
         </w:tc>
@@ -527,7 +527,7 @@
           </w:tcPr>
           <w:p>
             <w:r>
-              <w:t>4.85</w:t>
+              <w:t>26.55</w:t>
             </w:r>
           </w:p>
         </w:tc>
@@ -537,7 +537,7 @@
           </w:tcPr>
           <w:p>
             <w:r>
-              <w:t>88.62%</w:t>
+              <w:t>126.62%</w:t>
             </w:r>
           </w:p>
         </w:tc>
@@ -612,7 +612,7 @@
           </w:tcPr>
           <w:p>
             <w:r>
-              <w:t>1.80</w:t>
+              <w:t>5.78</w:t>
             </w:r>
           </w:p>
         </w:tc>
@@ -622,7 +622,7 @@
           </w:tcPr>
           <w:p>
             <w:r>
-              <w:t>106.23%</w:t>
+              <w:t>250.02%</w:t>
             </w:r>
           </w:p>
         </w:tc>
@@ -644,7 +644,7 @@
           </w:tcPr>
           <w:p>
             <w:r>
-              <w:t>5.40</w:t>
+              <w:t>52.46</w:t>
             </w:r>
           </w:p>
         </w:tc>
@@ -654,7 +654,7 @@
           </w:tcPr>
           <w:p>
             <w:r>
-              <w:t>117.43%</w:t>
+              <w:t>298.21%</w:t>
             </w:r>
           </w:p>
         </w:tc>
@@ -676,7 +676,7 @@
           </w:tcPr>
           <w:p>
             <w:r>
-              <w:t>0.78</w:t>
+              <w:t>3.43</w:t>
             </w:r>
           </w:p>
         </w:tc>
@@ -686,7 +686,7 @@
           </w:tcPr>
           <w:p>
             <w:r>
-              <w:t>37.13%</w:t>
+              <w:t>87.58%</w:t>
             </w:r>
           </w:p>
         </w:tc>
@@ -708,7 +708,7 @@
           </w:tcPr>
           <w:p>
             <w:r>
-              <w:t>3.45</w:t>
+              <w:t>28.90</w:t>
             </w:r>
           </w:p>
         </w:tc>
@@ -718,7 +718,7 @@
           </w:tcPr>
           <w:p>
             <w:r>
-              <w:t>109.80%</w:t>
+              <w:t>140.47%</w:t>
             </w:r>
           </w:p>
         </w:tc>
@@ -740,7 +740,7 @@
           </w:tcPr>
           <w:p>
             <w:r>
-              <w:t>2.57</w:t>
+              <w:t>13.35</w:t>
             </w:r>
           </w:p>
         </w:tc>
@@ -750,7 +750,7 @@
           </w:tcPr>
           <w:p>
             <w:r>
-              <w:t>36.39%</w:t>
+              <w:t>25.87%</w:t>
             </w:r>
           </w:p>
         </w:tc>
@@ -772,7 +772,7 @@
           </w:tcPr>
           <w:p>
             <w:r>
-              <w:t>6.51</w:t>
+              <w:t>38.12</w:t>
             </w:r>
           </w:p>
         </w:tc>
@@ -782,7 +782,7 @@
           </w:tcPr>
           <w:p>
             <w:r>
-              <w:t>22.79%</w:t>
+              <w:t>21.73%</w:t>
             </w:r>
           </w:p>
         </w:tc>
@@ -799,7 +799,7 @@
     </w:p>
     <w:p>
       <w:r>
-        <w:t>Overall RMSE = 3.96, MAPE = 71.63%. Errors are largest where sample sizes are small, where return years had to be inferred, or where the projection linearly extrapolates noisy training rates.</w:t>
+        <w:t>Overall RMSE = 29.62, MAPE = 137.31%. Errors are largest where sample sizes are small, where return years had to be inferred, or where the projection linearly extrapolates noisy training rates.</w:t>
       </w:r>
     </w:p>
     <w:p>

</xml_diff>

<commit_message>
fix(ode): recalibrate endogenous inflow (P0 = g I) and guard policy counterfactuals; regenerate full-cohort results, figures and manuscripts
- ode_model_endogenous.py now calibrates I0 so total equilibrium inflow matches observed I, keeping all civilisations including Japanese and aligning T_equilibrium with the non-endogenous model.

- policy_counterfactuals.py skips missing groups instead of crashing.

- reproduce.sh completed end-to-end on the 723,647-author cohort; all results/ docs/ and figures updated.

Co-Authored-By: Tatsuki Onishi <bougtoir@gmail.com>
</commit_message>
<xml_diff>
--- a/researcher_mobility_ode/docs/annual_rates_projection_report.docx
+++ b/researcher_mobility_ode/docs/annual_rates_projection_report.docx
@@ -99,7 +99,7 @@
       <w:r>
         <w:drawing>
           <wp:inline xmlns:a="http://schemas.openxmlformats.org/drawingml/2006/main" xmlns:pic="http://schemas.openxmlformats.org/drawingml/2006/picture">
-            <wp:extent cx="5029200" cy="4164037"/>
+            <wp:extent cx="5029200" cy="4052108"/>
             <wp:docPr id="2" name="Picture 2"/>
             <wp:cNvGraphicFramePr>
               <a:graphicFrameLocks noChangeAspect="1"/>
@@ -120,7 +120,7 @@
                   <pic:spPr>
                     <a:xfrm>
                       <a:off x="0" y="0"/>
-                      <a:ext cx="5029200" cy="4164037"/>
+                      <a:ext cx="5029200" cy="4052108"/>
                     </a:xfrm>
                     <a:prstGeom prst="rect"/>
                   </pic:spPr>
@@ -170,7 +170,7 @@
       <w:r>
         <w:drawing>
           <wp:inline xmlns:a="http://schemas.openxmlformats.org/drawingml/2006/main" xmlns:pic="http://schemas.openxmlformats.org/drawingml/2006/picture">
-            <wp:extent cx="5943600" cy="3791693"/>
+            <wp:extent cx="5943600" cy="3790898"/>
             <wp:docPr id="3" name="Picture 3"/>
             <wp:cNvGraphicFramePr>
               <a:graphicFrameLocks noChangeAspect="1"/>
@@ -191,7 +191,7 @@
                   <pic:spPr>
                     <a:xfrm>
                       <a:off x="0" y="0"/>
-                      <a:ext cx="5943600" cy="3791693"/>
+                      <a:ext cx="5943600" cy="3790898"/>
                     </a:xfrm>
                     <a:prstGeom prst="rect"/>
                   </pic:spPr>
@@ -271,7 +271,7 @@
           </w:tcPr>
           <w:p>
             <w:r>
-              <w:t>6.32</w:t>
+              <w:t>5197.55</w:t>
             </w:r>
           </w:p>
         </w:tc>
@@ -281,7 +281,7 @@
           </w:tcPr>
           <w:p>
             <w:r>
-              <w:t>76.13%</w:t>
+              <w:t>118.94%</w:t>
             </w:r>
           </w:p>
         </w:tc>
@@ -303,7 +303,7 @@
           </w:tcPr>
           <w:p>
             <w:r>
-              <w:t>29.90</w:t>
+              <w:t>16500.01</w:t>
             </w:r>
           </w:p>
         </w:tc>
@@ -313,7 +313,7 @@
           </w:tcPr>
           <w:p>
             <w:r>
-              <w:t>134.87%</w:t>
+              <w:t>136.04%</w:t>
             </w:r>
           </w:p>
         </w:tc>
@@ -335,7 +335,7 @@
           </w:tcPr>
           <w:p>
             <w:r>
-              <w:t>49.35</w:t>
+              <w:t>8903.72</w:t>
             </w:r>
           </w:p>
         </w:tc>
@@ -345,7 +345,7 @@
           </w:tcPr>
           <w:p>
             <w:r>
-              <w:t>134.90%</w:t>
+              <w:t>226.79%</w:t>
             </w:r>
           </w:p>
         </w:tc>
@@ -367,7 +367,7 @@
           </w:tcPr>
           <w:p>
             <w:r>
-              <w:t>47.47</w:t>
+              <w:t>18638.50</w:t>
             </w:r>
           </w:p>
         </w:tc>
@@ -377,7 +377,7 @@
           </w:tcPr>
           <w:p>
             <w:r>
-              <w:t>305.04%</w:t>
+              <w:t>304.03%</w:t>
             </w:r>
           </w:p>
         </w:tc>
@@ -399,7 +399,7 @@
           </w:tcPr>
           <w:p>
             <w:r>
-              <w:t>15.79</w:t>
+              <w:t>2522.43</w:t>
             </w:r>
           </w:p>
         </w:tc>
@@ -409,7 +409,7 @@
           </w:tcPr>
           <w:p>
             <w:r>
-              <w:t>66.04%</w:t>
+              <w:t>109.17%</w:t>
             </w:r>
           </w:p>
         </w:tc>
@@ -431,7 +431,7 @@
           </w:tcPr>
           <w:p>
             <w:r>
-              <w:t>24.85</w:t>
+              <w:t>7835.35</w:t>
             </w:r>
           </w:p>
         </w:tc>
@@ -441,7 +441,7 @@
           </w:tcPr>
           <w:p>
             <w:r>
-              <w:t>122.96%</w:t>
+              <w:t>152.39%</w:t>
             </w:r>
           </w:p>
         </w:tc>
@@ -463,7 +463,7 @@
           </w:tcPr>
           <w:p>
             <w:r>
-              <w:t>11.31</w:t>
+              <w:t>347.32</w:t>
             </w:r>
           </w:p>
         </w:tc>
@@ -473,7 +473,7 @@
           </w:tcPr>
           <w:p>
             <w:r>
-              <w:t>197.81%</w:t>
+              <w:t>136.00%</w:t>
             </w:r>
           </w:p>
         </w:tc>
@@ -495,7 +495,7 @@
           </w:tcPr>
           <w:p>
             <w:r>
-              <w:t>23.92</w:t>
+              <w:t>24143.42</w:t>
             </w:r>
           </w:p>
         </w:tc>
@@ -505,7 +505,7 @@
           </w:tcPr>
           <w:p>
             <w:r>
-              <w:t>71.44%</w:t>
+              <w:t>148.71%</w:t>
             </w:r>
           </w:p>
         </w:tc>
@@ -527,7 +527,7 @@
           </w:tcPr>
           <w:p>
             <w:r>
-              <w:t>26.55</w:t>
+              <w:t>10150.43</w:t>
             </w:r>
           </w:p>
         </w:tc>
@@ -537,7 +537,7 @@
           </w:tcPr>
           <w:p>
             <w:r>
-              <w:t>126.62%</w:t>
+              <w:t>103.90%</w:t>
             </w:r>
           </w:p>
         </w:tc>
@@ -612,7 +612,7 @@
           </w:tcPr>
           <w:p>
             <w:r>
-              <w:t>5.78</w:t>
+              <w:t>1026.36</w:t>
             </w:r>
           </w:p>
         </w:tc>
@@ -622,7 +622,7 @@
           </w:tcPr>
           <w:p>
             <w:r>
-              <w:t>250.02%</w:t>
+              <w:t>264.92%</w:t>
             </w:r>
           </w:p>
         </w:tc>
@@ -644,7 +644,7 @@
           </w:tcPr>
           <w:p>
             <w:r>
-              <w:t>52.46</w:t>
+              <w:t>23018.59</w:t>
             </w:r>
           </w:p>
         </w:tc>
@@ -654,7 +654,7 @@
           </w:tcPr>
           <w:p>
             <w:r>
-              <w:t>298.21%</w:t>
+              <w:t>311.98%</w:t>
             </w:r>
           </w:p>
         </w:tc>
@@ -676,7 +676,7 @@
           </w:tcPr>
           <w:p>
             <w:r>
-              <w:t>3.43</w:t>
+              <w:t>527.95</w:t>
             </w:r>
           </w:p>
         </w:tc>
@@ -686,7 +686,7 @@
           </w:tcPr>
           <w:p>
             <w:r>
-              <w:t>87.58%</w:t>
+              <w:t>66.15%</w:t>
             </w:r>
           </w:p>
         </w:tc>
@@ -708,7 +708,7 @@
           </w:tcPr>
           <w:p>
             <w:r>
-              <w:t>28.90</w:t>
+              <w:t>10307.61</w:t>
             </w:r>
           </w:p>
         </w:tc>
@@ -718,7 +718,7 @@
           </w:tcPr>
           <w:p>
             <w:r>
-              <w:t>140.47%</w:t>
+              <w:t>210.60%</w:t>
             </w:r>
           </w:p>
         </w:tc>
@@ -740,7 +740,7 @@
           </w:tcPr>
           <w:p>
             <w:r>
-              <w:t>13.35</w:t>
+              <w:t>2004.61</w:t>
             </w:r>
           </w:p>
         </w:tc>
@@ -750,7 +750,7 @@
           </w:tcPr>
           <w:p>
             <w:r>
-              <w:t>25.87%</w:t>
+              <w:t>47.01%</w:t>
             </w:r>
           </w:p>
         </w:tc>
@@ -772,7 +772,7 @@
           </w:tcPr>
           <w:p>
             <w:r>
-              <w:t>38.12</w:t>
+              <w:t>18575.39</w:t>
             </w:r>
           </w:p>
         </w:tc>
@@ -782,7 +782,7 @@
           </w:tcPr>
           <w:p>
             <w:r>
-              <w:t>21.73%</w:t>
+              <w:t>56.66%</w:t>
             </w:r>
           </w:p>
         </w:tc>
@@ -799,7 +799,7 @@
     </w:p>
     <w:p>
       <w:r>
-        <w:t>Overall RMSE = 29.62, MAPE = 137.31%. Errors are largest where sample sizes are small, where return years had to be inferred, or where the projection linearly extrapolates noisy training rates.</w:t>
+        <w:t>Overall RMSE = 12822.49, MAPE = 159.55%. Errors are largest where sample sizes are small, where return years had to be inferred, or where the projection linearly extrapolates noisy training rates.</w:t>
       </w:r>
     </w:p>
     <w:p>

</xml_diff>

<commit_message>
fix(openalex): use Authorization header, RFC Retry-After parsing, fail-fast batch retries; widen hit definition to top-10% regardless of authorship and regenerate full-cohort results/manuscript
Co-Authored-By: Tatsuki Onishi <bougtoir@gmail.com>
</commit_message>
<xml_diff>
--- a/researcher_mobility_ode/docs/annual_rates_projection_report.docx
+++ b/researcher_mobility_ode/docs/annual_rates_projection_report.docx
@@ -271,7 +271,7 @@
           </w:tcPr>
           <w:p>
             <w:r>
-              <w:t>5197.55</w:t>
+              <w:t>5045.95</w:t>
             </w:r>
           </w:p>
         </w:tc>
@@ -281,7 +281,7 @@
           </w:tcPr>
           <w:p>
             <w:r>
-              <w:t>118.94%</w:t>
+              <w:t>116.98%</w:t>
             </w:r>
           </w:p>
         </w:tc>
@@ -303,7 +303,7 @@
           </w:tcPr>
           <w:p>
             <w:r>
-              <w:t>16500.01</w:t>
+              <w:t>16427.90</w:t>
             </w:r>
           </w:p>
         </w:tc>
@@ -313,7 +313,7 @@
           </w:tcPr>
           <w:p>
             <w:r>
-              <w:t>136.04%</w:t>
+              <w:t>137.28%</w:t>
             </w:r>
           </w:p>
         </w:tc>
@@ -335,7 +335,7 @@
           </w:tcPr>
           <w:p>
             <w:r>
-              <w:t>8903.72</w:t>
+              <w:t>8871.05</w:t>
             </w:r>
           </w:p>
         </w:tc>
@@ -345,7 +345,7 @@
           </w:tcPr>
           <w:p>
             <w:r>
-              <w:t>226.79%</w:t>
+              <w:t>223.34%</w:t>
             </w:r>
           </w:p>
         </w:tc>
@@ -367,7 +367,7 @@
           </w:tcPr>
           <w:p>
             <w:r>
-              <w:t>18638.50</w:t>
+              <w:t>18803.07</w:t>
             </w:r>
           </w:p>
         </w:tc>
@@ -377,7 +377,7 @@
           </w:tcPr>
           <w:p>
             <w:r>
-              <w:t>304.03%</w:t>
+              <w:t>307.74%</w:t>
             </w:r>
           </w:p>
         </w:tc>
@@ -399,7 +399,7 @@
           </w:tcPr>
           <w:p>
             <w:r>
-              <w:t>2522.43</w:t>
+              <w:t>2487.82</w:t>
             </w:r>
           </w:p>
         </w:tc>
@@ -409,7 +409,7 @@
           </w:tcPr>
           <w:p>
             <w:r>
-              <w:t>109.17%</w:t>
+              <w:t>106.56%</w:t>
             </w:r>
           </w:p>
         </w:tc>
@@ -431,7 +431,7 @@
           </w:tcPr>
           <w:p>
             <w:r>
-              <w:t>7835.35</w:t>
+              <w:t>7835.00</w:t>
             </w:r>
           </w:p>
         </w:tc>
@@ -441,7 +441,7 @@
           </w:tcPr>
           <w:p>
             <w:r>
-              <w:t>152.39%</w:t>
+              <w:t>167.10%</w:t>
             </w:r>
           </w:p>
         </w:tc>
@@ -463,7 +463,7 @@
           </w:tcPr>
           <w:p>
             <w:r>
-              <w:t>347.32</w:t>
+              <w:t>351.16</w:t>
             </w:r>
           </w:p>
         </w:tc>
@@ -473,7 +473,7 @@
           </w:tcPr>
           <w:p>
             <w:r>
-              <w:t>136.00%</w:t>
+              <w:t>131.59%</w:t>
             </w:r>
           </w:p>
         </w:tc>
@@ -495,7 +495,7 @@
           </w:tcPr>
           <w:p>
             <w:r>
-              <w:t>24143.42</w:t>
+              <w:t>24182.04</w:t>
             </w:r>
           </w:p>
         </w:tc>
@@ -505,7 +505,7 @@
           </w:tcPr>
           <w:p>
             <w:r>
-              <w:t>148.71%</w:t>
+              <w:t>160.11%</w:t>
             </w:r>
           </w:p>
         </w:tc>
@@ -527,7 +527,7 @@
           </w:tcPr>
           <w:p>
             <w:r>
-              <w:t>10150.43</w:t>
+              <w:t>10293.03</w:t>
             </w:r>
           </w:p>
         </w:tc>
@@ -537,7 +537,7 @@
           </w:tcPr>
           <w:p>
             <w:r>
-              <w:t>103.90%</w:t>
+              <w:t>106.86%</w:t>
             </w:r>
           </w:p>
         </w:tc>
@@ -612,7 +612,7 @@
           </w:tcPr>
           <w:p>
             <w:r>
-              <w:t>1026.36</w:t>
+              <w:t>1043.17</w:t>
             </w:r>
           </w:p>
         </w:tc>
@@ -622,7 +622,7 @@
           </w:tcPr>
           <w:p>
             <w:r>
-              <w:t>264.92%</w:t>
+              <w:t>275.63%</w:t>
             </w:r>
           </w:p>
         </w:tc>
@@ -644,7 +644,7 @@
           </w:tcPr>
           <w:p>
             <w:r>
-              <w:t>23018.59</w:t>
+              <w:t>23067.25</w:t>
             </w:r>
           </w:p>
         </w:tc>
@@ -654,7 +654,7 @@
           </w:tcPr>
           <w:p>
             <w:r>
-              <w:t>311.98%</w:t>
+              <w:t>311.56%</w:t>
             </w:r>
           </w:p>
         </w:tc>
@@ -676,7 +676,7 @@
           </w:tcPr>
           <w:p>
             <w:r>
-              <w:t>527.95</w:t>
+              <w:t>552.28</w:t>
             </w:r>
           </w:p>
         </w:tc>
@@ -686,7 +686,7 @@
           </w:tcPr>
           <w:p>
             <w:r>
-              <w:t>66.15%</w:t>
+              <w:t>69.75%</w:t>
             </w:r>
           </w:p>
         </w:tc>
@@ -708,7 +708,7 @@
           </w:tcPr>
           <w:p>
             <w:r>
-              <w:t>10307.61</w:t>
+              <w:t>10318.58</w:t>
             </w:r>
           </w:p>
         </w:tc>
@@ -718,7 +718,7 @@
           </w:tcPr>
           <w:p>
             <w:r>
-              <w:t>210.60%</w:t>
+              <w:t>211.19%</w:t>
             </w:r>
           </w:p>
         </w:tc>
@@ -740,7 +740,7 @@
           </w:tcPr>
           <w:p>
             <w:r>
-              <w:t>2004.61</w:t>
+              <w:t>2056.79</w:t>
             </w:r>
           </w:p>
         </w:tc>
@@ -750,7 +750,7 @@
           </w:tcPr>
           <w:p>
             <w:r>
-              <w:t>47.01%</w:t>
+              <w:t>46.73%</w:t>
             </w:r>
           </w:p>
         </w:tc>
@@ -772,7 +772,7 @@
           </w:tcPr>
           <w:p>
             <w:r>
-              <w:t>18575.39</w:t>
+              <w:t>18613.86</w:t>
             </w:r>
           </w:p>
         </w:tc>
@@ -782,7 +782,7 @@
           </w:tcPr>
           <w:p>
             <w:r>
-              <w:t>56.66%</w:t>
+              <w:t>56.84%</w:t>
             </w:r>
           </w:p>
         </w:tc>
@@ -799,7 +799,7 @@
     </w:p>
     <w:p>
       <w:r>
-        <w:t>Overall RMSE = 12822.49, MAPE = 159.55%. Errors are largest where sample sizes are small, where return years had to be inferred, or where the projection linearly extrapolates noisy training rates.</w:t>
+        <w:t>Overall RMSE = 12849.58, MAPE = 161.95%. Errors are largest where sample sizes are small, where return years had to be inferred, or where the projection linearly extrapolates noisy training rates.</w:t>
       </w:r>
     </w:p>
     <w:p>

</xml_diff>

<commit_message>
fix(annual,manuscript): anchor annual dropout to cohort hazard, exclude self/Unknown inter-civ flows, update captions and Methods text
Co-Authored-By: Tatsuki Onishi <bougtoir@gmail.com>
</commit_message>
<xml_diff>
--- a/researcher_mobility_ode/docs/annual_rates_projection_report.docx
+++ b/researcher_mobility_ode/docs/annual_rates_projection_report.docx
@@ -92,14 +92,14 @@
     </w:p>
     <w:p>
       <w:r>
-        <w:t>Figure 2 shows the total abroad author-years accumulated by origin and destination civilisation. Destination is approximated by the author’s recent_group for all years in which they are abroad; this is a lower-bound approximation because the exact year-to-year destination is not recorded in the public cohort.</w:t>
+        <w:t>Figure 2 shows the total cross-civilisation abroad author-years accumulated by origin and destination civilisation. Origin-destination cells with the same civilisation and destinations labelled Unknown are excluded because the exact year-to-year destination is not recorded in the public cohort.</w:t>
       </w:r>
     </w:p>
     <w:p>
       <w:r>
         <w:drawing>
           <wp:inline xmlns:a="http://schemas.openxmlformats.org/drawingml/2006/main" xmlns:pic="http://schemas.openxmlformats.org/drawingml/2006/picture">
-            <wp:extent cx="5029200" cy="4052108"/>
+            <wp:extent cx="5029200" cy="4088275"/>
             <wp:docPr id="2" name="Picture 2"/>
             <wp:cNvGraphicFramePr>
               <a:graphicFrameLocks noChangeAspect="1"/>
@@ -120,7 +120,7 @@
                   <pic:spPr>
                     <a:xfrm>
                       <a:off x="0" y="0"/>
-                      <a:ext cx="5029200" cy="4052108"/>
+                      <a:ext cx="5029200" cy="4088275"/>
                     </a:xfrm>
                     <a:prstGeom prst="rect"/>
                   </pic:spPr>
@@ -137,7 +137,7 @@
         <w:jc w:val="center"/>
       </w:pPr>
       <w:r>
-        <w:t>Figure 2. Total abroad stock by origin (rows) and destination (columns), 2000-2023.</w:t>
+        <w:t>Figure 2. Total cross-civilisation abroad author-years by origin (rows) and destination (columns), 2000-2023.</w:t>
       </w:r>
     </w:p>
     <w:p>
@@ -150,7 +150,7 @@
     </w:p>
     <w:p>
       <w:r>
-        <w:t>For each group, a linear trend is fit to 2000-2016 rates only when the fit explains at least 10% of variance and there are at least four observations; otherwise the historical mean is used. Projected rates are clipped to [0, 1]. Inflows are projected with a log1p-linear model with the same R2 guard. Correction pressures include: (a) Laplace smoothing for sparse cells; (b) replacing unreliable trends with the historical mean so that, for example, a few early returns do not extrapolate to zero beta; (c) capping dropout at 1.5 times its 90th percentile in the training window; (d) keeping all rates inside the [0, 1] probability interval; and (e) apportioning new entrants to the same first-compartment distribution observed in the training period. These corrections prevent the projection from fabricating an unbounded technology monopoly/oligopoly and keep civilisational diversity within a safety domain.</w:t>
+        <w:t>For each group, a linear trend is fit to 2000-2016 rates only when the fit explains at least 10% of variance and there are at least four observations; otherwise the historical mean is used. Projected rates are clipped to [0, 1]. Inflows are projected with a log1p-linear model with the same R2 guard. Correction pressures include: (a) Laplace smoothing for sparse cells; (b) replacing unreliable trends with the historical mean so that, for example, a few early returns do not extrapolate to zero beta; (c) anchoring annual dropout to the cohort-level per-year hazard because year-to-year final attrition is right-censored before 2023; (d) keeping all rates inside the [0, 1] probability interval; and (e) apportioning new entrants to the same first-compartment distribution observed in the training period. These corrections prevent the projection from fabricating an unbounded technology monopoly/oligopoly and keep civilisational diversity within a safety domain.</w:t>
       </w:r>
     </w:p>
     <w:p>
@@ -271,7 +271,7 @@
           </w:tcPr>
           <w:p>
             <w:r>
-              <w:t>5045.95</w:t>
+              <w:t>3545.91</w:t>
             </w:r>
           </w:p>
         </w:tc>
@@ -281,7 +281,7 @@
           </w:tcPr>
           <w:p>
             <w:r>
-              <w:t>116.98%</w:t>
+              <w:t>86.29%</w:t>
             </w:r>
           </w:p>
         </w:tc>
@@ -303,7 +303,7 @@
           </w:tcPr>
           <w:p>
             <w:r>
-              <w:t>16427.90</w:t>
+              <w:t>11675.98</w:t>
             </w:r>
           </w:p>
         </w:tc>
@@ -313,7 +313,7 @@
           </w:tcPr>
           <w:p>
             <w:r>
-              <w:t>137.28%</w:t>
+              <w:t>103.11%</w:t>
             </w:r>
           </w:p>
         </w:tc>
@@ -335,7 +335,7 @@
           </w:tcPr>
           <w:p>
             <w:r>
-              <w:t>8871.05</w:t>
+              <w:t>7893.85</w:t>
             </w:r>
           </w:p>
         </w:tc>
@@ -345,7 +345,7 @@
           </w:tcPr>
           <w:p>
             <w:r>
-              <w:t>223.34%</w:t>
+              <w:t>199.25%</w:t>
             </w:r>
           </w:p>
         </w:tc>
@@ -367,7 +367,7 @@
           </w:tcPr>
           <w:p>
             <w:r>
-              <w:t>18803.07</w:t>
+              <w:t>16747.65</w:t>
             </w:r>
           </w:p>
         </w:tc>
@@ -377,7 +377,7 @@
           </w:tcPr>
           <w:p>
             <w:r>
-              <w:t>307.74%</w:t>
+              <w:t>275.18%</w:t>
             </w:r>
           </w:p>
         </w:tc>
@@ -399,7 +399,7 @@
           </w:tcPr>
           <w:p>
             <w:r>
-              <w:t>2487.82</w:t>
+              <w:t>1677.51</w:t>
             </w:r>
           </w:p>
         </w:tc>
@@ -409,7 +409,7 @@
           </w:tcPr>
           <w:p>
             <w:r>
-              <w:t>106.56%</w:t>
+              <w:t>70.12%</w:t>
             </w:r>
           </w:p>
         </w:tc>
@@ -431,7 +431,7 @@
           </w:tcPr>
           <w:p>
             <w:r>
-              <w:t>7835.00</w:t>
+              <w:t>6151.05</w:t>
             </w:r>
           </w:p>
         </w:tc>
@@ -441,7 +441,7 @@
           </w:tcPr>
           <w:p>
             <w:r>
-              <w:t>167.10%</w:t>
+              <w:t>132.46%</w:t>
             </w:r>
           </w:p>
         </w:tc>
@@ -463,7 +463,7 @@
           </w:tcPr>
           <w:p>
             <w:r>
-              <w:t>351.16</w:t>
+              <w:t>259.88</w:t>
             </w:r>
           </w:p>
         </w:tc>
@@ -473,7 +473,7 @@
           </w:tcPr>
           <w:p>
             <w:r>
-              <w:t>131.59%</w:t>
+              <w:t>97.77%</w:t>
             </w:r>
           </w:p>
         </w:tc>
@@ -495,7 +495,7 @@
           </w:tcPr>
           <w:p>
             <w:r>
-              <w:t>24182.04</w:t>
+              <w:t>18773.11</w:t>
             </w:r>
           </w:p>
         </w:tc>
@@ -505,7 +505,7 @@
           </w:tcPr>
           <w:p>
             <w:r>
-              <w:t>160.11%</w:t>
+              <w:t>131.58%</w:t>
             </w:r>
           </w:p>
         </w:tc>
@@ -527,7 +527,7 @@
           </w:tcPr>
           <w:p>
             <w:r>
-              <w:t>10293.03</w:t>
+              <w:t>7014.93</w:t>
             </w:r>
           </w:p>
         </w:tc>
@@ -537,7 +537,7 @@
           </w:tcPr>
           <w:p>
             <w:r>
-              <w:t>106.86%</w:t>
+              <w:t>77.39%</w:t>
             </w:r>
           </w:p>
         </w:tc>
@@ -612,7 +612,7 @@
           </w:tcPr>
           <w:p>
             <w:r>
-              <w:t>1043.17</w:t>
+              <w:t>860.78</w:t>
             </w:r>
           </w:p>
         </w:tc>
@@ -622,7 +622,7 @@
           </w:tcPr>
           <w:p>
             <w:r>
-              <w:t>275.63%</w:t>
+              <w:t>224.23%</w:t>
             </w:r>
           </w:p>
         </w:tc>
@@ -644,7 +644,7 @@
           </w:tcPr>
           <w:p>
             <w:r>
-              <w:t>23067.25</w:t>
+              <w:t>19772.90</w:t>
             </w:r>
           </w:p>
         </w:tc>
@@ -654,7 +654,7 @@
           </w:tcPr>
           <w:p>
             <w:r>
-              <w:t>311.56%</w:t>
+              <w:t>262.82%</w:t>
             </w:r>
           </w:p>
         </w:tc>
@@ -676,7 +676,7 @@
           </w:tcPr>
           <w:p>
             <w:r>
-              <w:t>552.28</w:t>
+              <w:t>406.05</w:t>
             </w:r>
           </w:p>
         </w:tc>
@@ -686,7 +686,7 @@
           </w:tcPr>
           <w:p>
             <w:r>
-              <w:t>69.75%</w:t>
+              <w:t>50.90%</w:t>
             </w:r>
           </w:p>
         </w:tc>
@@ -708,7 +708,7 @@
           </w:tcPr>
           <w:p>
             <w:r>
-              <w:t>10318.58</w:t>
+              <w:t>8086.06</w:t>
             </w:r>
           </w:p>
         </w:tc>
@@ -718,7 +718,7 @@
           </w:tcPr>
           <w:p>
             <w:r>
-              <w:t>211.19%</w:t>
+              <w:t>170.66%</w:t>
             </w:r>
           </w:p>
         </w:tc>
@@ -740,7 +740,7 @@
           </w:tcPr>
           <w:p>
             <w:r>
-              <w:t>2056.79</w:t>
+              <w:t>1738.38</w:t>
             </w:r>
           </w:p>
         </w:tc>
@@ -750,7 +750,7 @@
           </w:tcPr>
           <w:p>
             <w:r>
-              <w:t>46.73%</w:t>
+              <w:t>35.50%</w:t>
             </w:r>
           </w:p>
         </w:tc>
@@ -772,7 +772,7 @@
           </w:tcPr>
           <w:p>
             <w:r>
-              <w:t>18613.86</w:t>
+              <w:t>12744.52</w:t>
             </w:r>
           </w:p>
         </w:tc>
@@ -782,7 +782,7 @@
           </w:tcPr>
           <w:p>
             <w:r>
-              <w:t>56.84%</w:t>
+              <w:t>38.00%</w:t>
             </w:r>
           </w:p>
         </w:tc>
@@ -799,7 +799,7 @@
     </w:p>
     <w:p>
       <w:r>
-        <w:t>Overall RMSE = 12849.58, MAPE = 161.95%. Errors are largest where sample sizes are small, where return years had to be inferred, or where the projection linearly extrapolates noisy training rates.</w:t>
+        <w:t>Overall RMSE = 10187.43, MAPE = 130.35%. Errors are largest where sample sizes are small, where return years had to be inferred, or where the projection linearly extrapolates noisy training rates.</w:t>
       </w:r>
     </w:p>
     <w:p>

</xml_diff>

<commit_message>
Unify Laplace smoothing to pseudocount 1 per outcome; align Data Availability text with public repo
Co-Authored-By: Tatsuki Onishi <bougtoir@gmail.com>
</commit_message>
<xml_diff>
--- a/researcher_mobility_ode/docs/annual_rates_projection_report.docx
+++ b/researcher_mobility_ode/docs/annual_rates_projection_report.docx
@@ -34,7 +34,7 @@
     </w:p>
     <w:p>
       <w:r>
-        <w:t>Transition probabilities are estimated as count / stock for each civilisation and year. Laplace smoothing (add-0.5) is applied to empty cells. Rates are mapped to the model parameters: alpha (D -&gt; A), beta (return from abroad), h_D/h_A (hit acquisition), p_D/p_A (PI promotion), and d (dropout).</w:t>
+        <w:t>Transition probabilities are estimated as count / stock for each civilisation and year. Laplace smoothing (add-1 per possible destination) is applied to empty cells. Rates are mapped to the model parameters: alpha (D -&gt; A), beta (return from abroad), h_D/h_A (hit acquisition), p_D/p_A (PI promotion), and d (dropout).</w:t>
       </w:r>
     </w:p>
     <w:p>
@@ -271,7 +271,7 @@
           </w:tcPr>
           <w:p>
             <w:r>
-              <w:t>3545.91</w:t>
+              <w:t>3544.26</w:t>
             </w:r>
           </w:p>
         </w:tc>
@@ -281,7 +281,7 @@
           </w:tcPr>
           <w:p>
             <w:r>
-              <w:t>86.29%</w:t>
+              <w:t>86.25%</w:t>
             </w:r>
           </w:p>
         </w:tc>
@@ -303,7 +303,7 @@
           </w:tcPr>
           <w:p>
             <w:r>
-              <w:t>11675.98</w:t>
+              <w:t>11674.84</w:t>
             </w:r>
           </w:p>
         </w:tc>
@@ -313,7 +313,7 @@
           </w:tcPr>
           <w:p>
             <w:r>
-              <w:t>103.11%</w:t>
+              <w:t>103.09%</w:t>
             </w:r>
           </w:p>
         </w:tc>
@@ -335,7 +335,7 @@
           </w:tcPr>
           <w:p>
             <w:r>
-              <w:t>7893.85</w:t>
+              <w:t>7915.72</w:t>
             </w:r>
           </w:p>
         </w:tc>
@@ -345,7 +345,7 @@
           </w:tcPr>
           <w:p>
             <w:r>
-              <w:t>199.25%</w:t>
+              <w:t>188.36%</w:t>
             </w:r>
           </w:p>
         </w:tc>
@@ -367,7 +367,7 @@
           </w:tcPr>
           <w:p>
             <w:r>
-              <w:t>16747.65</w:t>
+              <w:t>16757.46</w:t>
             </w:r>
           </w:p>
         </w:tc>
@@ -377,7 +377,7 @@
           </w:tcPr>
           <w:p>
             <w:r>
-              <w:t>275.18%</w:t>
+              <w:t>272.97%</w:t>
             </w:r>
           </w:p>
         </w:tc>
@@ -399,7 +399,7 @@
           </w:tcPr>
           <w:p>
             <w:r>
-              <w:t>1677.51</w:t>
+              <w:t>1677.63</w:t>
             </w:r>
           </w:p>
         </w:tc>
@@ -409,7 +409,7 @@
           </w:tcPr>
           <w:p>
             <w:r>
-              <w:t>70.12%</w:t>
+              <w:t>69.91%</w:t>
             </w:r>
           </w:p>
         </w:tc>
@@ -431,7 +431,7 @@
           </w:tcPr>
           <w:p>
             <w:r>
-              <w:t>6151.05</w:t>
+              <w:t>6149.73</w:t>
             </w:r>
           </w:p>
         </w:tc>
@@ -441,7 +441,7 @@
           </w:tcPr>
           <w:p>
             <w:r>
-              <w:t>132.46%</w:t>
+              <w:t>132.37%</w:t>
             </w:r>
           </w:p>
         </w:tc>
@@ -463,7 +463,7 @@
           </w:tcPr>
           <w:p>
             <w:r>
-              <w:t>259.88</w:t>
+              <w:t>256.88</w:t>
             </w:r>
           </w:p>
         </w:tc>
@@ -473,7 +473,7 @@
           </w:tcPr>
           <w:p>
             <w:r>
-              <w:t>97.77%</w:t>
+              <w:t>98.71%</w:t>
             </w:r>
           </w:p>
         </w:tc>
@@ -495,7 +495,7 @@
           </w:tcPr>
           <w:p>
             <w:r>
-              <w:t>18773.11</w:t>
+              <w:t>18771.59</w:t>
             </w:r>
           </w:p>
         </w:tc>
@@ -505,7 +505,7 @@
           </w:tcPr>
           <w:p>
             <w:r>
-              <w:t>131.58%</w:t>
+              <w:t>132.26%</w:t>
             </w:r>
           </w:p>
         </w:tc>
@@ -527,7 +527,7 @@
           </w:tcPr>
           <w:p>
             <w:r>
-              <w:t>7014.93</w:t>
+              <w:t>7013.54</w:t>
             </w:r>
           </w:p>
         </w:tc>
@@ -537,7 +537,7 @@
           </w:tcPr>
           <w:p>
             <w:r>
-              <w:t>77.39%</w:t>
+              <w:t>77.36%</w:t>
             </w:r>
           </w:p>
         </w:tc>
@@ -612,7 +612,7 @@
           </w:tcPr>
           <w:p>
             <w:r>
-              <w:t>860.78</w:t>
+              <w:t>849.47</w:t>
             </w:r>
           </w:p>
         </w:tc>
@@ -622,7 +622,7 @@
           </w:tcPr>
           <w:p>
             <w:r>
-              <w:t>224.23%</w:t>
+              <w:t>215.12%</w:t>
             </w:r>
           </w:p>
         </w:tc>
@@ -644,7 +644,7 @@
           </w:tcPr>
           <w:p>
             <w:r>
-              <w:t>19772.90</w:t>
+              <w:t>19801.25</w:t>
             </w:r>
           </w:p>
         </w:tc>
@@ -654,7 +654,7 @@
           </w:tcPr>
           <w:p>
             <w:r>
-              <w:t>262.82%</w:t>
+              <w:t>263.27%</w:t>
             </w:r>
           </w:p>
         </w:tc>
@@ -676,7 +676,7 @@
           </w:tcPr>
           <w:p>
             <w:r>
-              <w:t>406.05</w:t>
+              <w:t>394.83</w:t>
             </w:r>
           </w:p>
         </w:tc>
@@ -686,7 +686,7 @@
           </w:tcPr>
           <w:p>
             <w:r>
-              <w:t>50.90%</w:t>
+              <w:t>50.08%</w:t>
             </w:r>
           </w:p>
         </w:tc>
@@ -708,7 +708,7 @@
           </w:tcPr>
           <w:p>
             <w:r>
-              <w:t>8086.06</w:t>
+              <w:t>8094.10</w:t>
             </w:r>
           </w:p>
         </w:tc>
@@ -718,7 +718,7 @@
           </w:tcPr>
           <w:p>
             <w:r>
-              <w:t>170.66%</w:t>
+              <w:t>171.62%</w:t>
             </w:r>
           </w:p>
         </w:tc>
@@ -740,7 +740,7 @@
           </w:tcPr>
           <w:p>
             <w:r>
-              <w:t>1738.38</w:t>
+              <w:t>1744.50</w:t>
             </w:r>
           </w:p>
         </w:tc>
@@ -750,7 +750,7 @@
           </w:tcPr>
           <w:p>
             <w:r>
-              <w:t>35.50%</w:t>
+              <w:t>36.43%</w:t>
             </w:r>
           </w:p>
         </w:tc>
@@ -772,7 +772,7 @@
           </w:tcPr>
           <w:p>
             <w:r>
-              <w:t>12744.52</w:t>
+              <w:t>12709.83</w:t>
             </w:r>
           </w:p>
         </w:tc>
@@ -782,7 +782,7 @@
           </w:tcPr>
           <w:p>
             <w:r>
-              <w:t>38.00%</w:t>
+              <w:t>37.66%</w:t>
             </w:r>
           </w:p>
         </w:tc>
@@ -799,7 +799,7 @@
     </w:p>
     <w:p>
       <w:r>
-        <w:t>Overall RMSE = 10187.43, MAPE = 130.35%. Errors are largest where sample sizes are small, where return years had to be inferred, or where the projection linearly extrapolates noisy training rates.</w:t>
+        <w:t>Overall RMSE = 10190.39, MAPE = 129.03%. Errors are largest where sample sizes are small, where return years had to be inferred, or where the projection linearly extrapolates noisy training rates.</w:t>
       </w:r>
     </w:p>
     <w:p>

</xml_diff>

<commit_message>
Add rate-level validation, saturating PNR robustness table, and civilisation-label prior literature
Co-Authored-By: Tatsuki Onishi <bougtoir@gmail.com>
</commit_message>
<xml_diff>
--- a/researcher_mobility_ode/docs/annual_rates_projection_report.docx
+++ b/researcher_mobility_ode/docs/annual_rates_projection_report.docx
@@ -807,6 +807,544 @@
         <w:pStyle w:val="Heading1"/>
       </w:pPr>
       <w:r>
+        <w:t>5a. Rate-level forecast validation</w:t>
+      </w:r>
+    </w:p>
+    <w:p>
+      <w:r>
+        <w:t>Stock-level projection is sensitive to the fact that the fixed cohort has no post-2016 new entrants, so the rate-level forecast provides a cleaner validation of the annual layer. Table 3 reports RMSE, MAE and a skill ratio against a historical-mean baseline for each transition rate. A skill ratio above 1.0 indicates that the projected rates improve on the baseline.</w:t>
+      </w:r>
+    </w:p>
+    <w:tbl>
+      <w:tblPr>
+        <w:tblStyle w:val="TableGrid"/>
+        <w:tblW w:type="auto" w:w="0"/>
+        <w:tblLook w:firstColumn="1" w:firstRow="1" w:lastColumn="0" w:lastRow="0" w:noHBand="0" w:noVBand="1" w:val="04A0"/>
+      </w:tblPr>
+      <w:tblGrid>
+        <w:gridCol w:w="1440"/>
+        <w:gridCol w:w="1440"/>
+        <w:gridCol w:w="1440"/>
+        <w:gridCol w:w="1440"/>
+        <w:gridCol w:w="1440"/>
+        <w:gridCol w:w="1440"/>
+      </w:tblGrid>
+      <w:tr>
+        <w:tc>
+          <w:tcPr>
+            <w:tcW w:type="dxa" w:w="1440"/>
+          </w:tcPr>
+          <w:p>
+            <w:r>
+              <w:t>Rate</w:t>
+            </w:r>
+          </w:p>
+        </w:tc>
+        <w:tc>
+          <w:tcPr>
+            <w:tcW w:type="dxa" w:w="1440"/>
+          </w:tcPr>
+          <w:p>
+            <w:r>
+              <w:t>RMSE</w:t>
+            </w:r>
+          </w:p>
+        </w:tc>
+        <w:tc>
+          <w:tcPr>
+            <w:tcW w:type="dxa" w:w="1440"/>
+          </w:tcPr>
+          <w:p>
+            <w:r>
+              <w:t>MAE</w:t>
+            </w:r>
+          </w:p>
+        </w:tc>
+        <w:tc>
+          <w:tcPr>
+            <w:tcW w:type="dxa" w:w="1440"/>
+          </w:tcPr>
+          <w:p>
+            <w:r>
+              <w:t>MAPE</w:t>
+            </w:r>
+          </w:p>
+        </w:tc>
+        <w:tc>
+          <w:tcPr>
+            <w:tcW w:type="dxa" w:w="1440"/>
+          </w:tcPr>
+          <w:p>
+            <w:r>
+              <w:t>Naive RMSE</w:t>
+            </w:r>
+          </w:p>
+        </w:tc>
+        <w:tc>
+          <w:tcPr>
+            <w:tcW w:type="dxa" w:w="1440"/>
+          </w:tcPr>
+          <w:p>
+            <w:r>
+              <w:t>Skill</w:t>
+            </w:r>
+          </w:p>
+        </w:tc>
+      </w:tr>
+      <w:tr>
+        <w:tc>
+          <w:tcPr>
+            <w:tcW w:type="dxa" w:w="1440"/>
+          </w:tcPr>
+          <w:p>
+            <w:r>
+              <w:t>alpha</w:t>
+            </w:r>
+          </w:p>
+        </w:tc>
+        <w:tc>
+          <w:tcPr>
+            <w:tcW w:type="dxa" w:w="1440"/>
+          </w:tcPr>
+          <w:p>
+            <w:r>
+              <w:t>0.0052</w:t>
+            </w:r>
+          </w:p>
+        </w:tc>
+        <w:tc>
+          <w:tcPr>
+            <w:tcW w:type="dxa" w:w="1440"/>
+          </w:tcPr>
+          <w:p>
+            <w:r>
+              <w:t>0.0038</w:t>
+            </w:r>
+          </w:p>
+        </w:tc>
+        <w:tc>
+          <w:tcPr>
+            <w:tcW w:type="dxa" w:w="1440"/>
+          </w:tcPr>
+          <w:p>
+            <w:r>
+              <w:t>72.7%</w:t>
+            </w:r>
+          </w:p>
+        </w:tc>
+        <w:tc>
+          <w:tcPr>
+            <w:tcW w:type="dxa" w:w="1440"/>
+          </w:tcPr>
+          <w:p>
+            <w:r>
+              <w:t>0.0055</w:t>
+            </w:r>
+          </w:p>
+        </w:tc>
+        <w:tc>
+          <w:tcPr>
+            <w:tcW w:type="dxa" w:w="1440"/>
+          </w:tcPr>
+          <w:p>
+            <w:r>
+              <w:t>1.06</w:t>
+            </w:r>
+          </w:p>
+        </w:tc>
+      </w:tr>
+      <w:tr>
+        <w:tc>
+          <w:tcPr>
+            <w:tcW w:type="dxa" w:w="1440"/>
+          </w:tcPr>
+          <w:p>
+            <w:r>
+              <w:t>beta</w:t>
+            </w:r>
+          </w:p>
+        </w:tc>
+        <w:tc>
+          <w:tcPr>
+            <w:tcW w:type="dxa" w:w="1440"/>
+          </w:tcPr>
+          <w:p>
+            <w:r>
+              <w:t>0.2152</w:t>
+            </w:r>
+          </w:p>
+        </w:tc>
+        <w:tc>
+          <w:tcPr>
+            <w:tcW w:type="dxa" w:w="1440"/>
+          </w:tcPr>
+          <w:p>
+            <w:r>
+              <w:t>0.1077</w:t>
+            </w:r>
+          </w:p>
+        </w:tc>
+        <w:tc>
+          <w:tcPr>
+            <w:tcW w:type="dxa" w:w="1440"/>
+          </w:tcPr>
+          <w:p>
+            <w:r>
+              <w:t>992.2%</w:t>
+            </w:r>
+          </w:p>
+        </w:tc>
+        <w:tc>
+          <w:tcPr>
+            <w:tcW w:type="dxa" w:w="1440"/>
+          </w:tcPr>
+          <w:p>
+            <w:r>
+              <w:t>0.2184</w:t>
+            </w:r>
+          </w:p>
+        </w:tc>
+        <w:tc>
+          <w:tcPr>
+            <w:tcW w:type="dxa" w:w="1440"/>
+          </w:tcPr>
+          <w:p>
+            <w:r>
+              <w:t>1.01</w:t>
+            </w:r>
+          </w:p>
+        </w:tc>
+      </w:tr>
+      <w:tr>
+        <w:tc>
+          <w:tcPr>
+            <w:tcW w:type="dxa" w:w="1440"/>
+          </w:tcPr>
+          <w:p>
+            <w:r>
+              <w:t>h_D</w:t>
+            </w:r>
+          </w:p>
+        </w:tc>
+        <w:tc>
+          <w:tcPr>
+            <w:tcW w:type="dxa" w:w="1440"/>
+          </w:tcPr>
+          <w:p>
+            <w:r>
+              <w:t>0.0205</w:t>
+            </w:r>
+          </w:p>
+        </w:tc>
+        <w:tc>
+          <w:tcPr>
+            <w:tcW w:type="dxa" w:w="1440"/>
+          </w:tcPr>
+          <w:p>
+            <w:r>
+              <w:t>0.0160</w:t>
+            </w:r>
+          </w:p>
+        </w:tc>
+        <w:tc>
+          <w:tcPr>
+            <w:tcW w:type="dxa" w:w="1440"/>
+          </w:tcPr>
+          <w:p>
+            <w:r>
+              <w:t>390.6%</w:t>
+            </w:r>
+          </w:p>
+        </w:tc>
+        <w:tc>
+          <w:tcPr>
+            <w:tcW w:type="dxa" w:w="1440"/>
+          </w:tcPr>
+          <w:p>
+            <w:r>
+              <w:t>0.0225</w:t>
+            </w:r>
+          </w:p>
+        </w:tc>
+        <w:tc>
+          <w:tcPr>
+            <w:tcW w:type="dxa" w:w="1440"/>
+          </w:tcPr>
+          <w:p>
+            <w:r>
+              <w:t>1.09</w:t>
+            </w:r>
+          </w:p>
+        </w:tc>
+      </w:tr>
+      <w:tr>
+        <w:tc>
+          <w:tcPr>
+            <w:tcW w:type="dxa" w:w="1440"/>
+          </w:tcPr>
+          <w:p>
+            <w:r>
+              <w:t>h_A</w:t>
+            </w:r>
+          </w:p>
+        </w:tc>
+        <w:tc>
+          <w:tcPr>
+            <w:tcW w:type="dxa" w:w="1440"/>
+          </w:tcPr>
+          <w:p>
+            <w:r>
+              <w:t>0.0204</w:t>
+            </w:r>
+          </w:p>
+        </w:tc>
+        <w:tc>
+          <w:tcPr>
+            <w:tcW w:type="dxa" w:w="1440"/>
+          </w:tcPr>
+          <w:p>
+            <w:r>
+              <w:t>0.0160</w:t>
+            </w:r>
+          </w:p>
+        </w:tc>
+        <w:tc>
+          <w:tcPr>
+            <w:tcW w:type="dxa" w:w="1440"/>
+          </w:tcPr>
+          <w:p>
+            <w:r>
+              <w:t>101.5%</w:t>
+            </w:r>
+          </w:p>
+        </w:tc>
+        <w:tc>
+          <w:tcPr>
+            <w:tcW w:type="dxa" w:w="1440"/>
+          </w:tcPr>
+          <w:p>
+            <w:r>
+              <w:t>0.0303</w:t>
+            </w:r>
+          </w:p>
+        </w:tc>
+        <w:tc>
+          <w:tcPr>
+            <w:tcW w:type="dxa" w:w="1440"/>
+          </w:tcPr>
+          <w:p>
+            <w:r>
+              <w:t>1.48</w:t>
+            </w:r>
+          </w:p>
+        </w:tc>
+      </w:tr>
+      <w:tr>
+        <w:tc>
+          <w:tcPr>
+            <w:tcW w:type="dxa" w:w="1440"/>
+          </w:tcPr>
+          <w:p>
+            <w:r>
+              <w:t>p_D</w:t>
+            </w:r>
+          </w:p>
+        </w:tc>
+        <w:tc>
+          <w:tcPr>
+            <w:tcW w:type="dxa" w:w="1440"/>
+          </w:tcPr>
+          <w:p>
+            <w:r>
+              <w:t>0.0573</w:t>
+            </w:r>
+          </w:p>
+        </w:tc>
+        <w:tc>
+          <w:tcPr>
+            <w:tcW w:type="dxa" w:w="1440"/>
+          </w:tcPr>
+          <w:p>
+            <w:r>
+              <w:t>0.0509</w:t>
+            </w:r>
+          </w:p>
+        </w:tc>
+        <w:tc>
+          <w:tcPr>
+            <w:tcW w:type="dxa" w:w="1440"/>
+          </w:tcPr>
+          <w:p>
+            <w:r>
+              <w:t>247.8%</w:t>
+            </w:r>
+          </w:p>
+        </w:tc>
+        <w:tc>
+          <w:tcPr>
+            <w:tcW w:type="dxa" w:w="1440"/>
+          </w:tcPr>
+          <w:p>
+            <w:r>
+              <w:t>0.0376</w:t>
+            </w:r>
+          </w:p>
+        </w:tc>
+        <w:tc>
+          <w:tcPr>
+            <w:tcW w:type="dxa" w:w="1440"/>
+          </w:tcPr>
+          <w:p>
+            <w:r>
+              <w:t>0.66</w:t>
+            </w:r>
+          </w:p>
+        </w:tc>
+      </w:tr>
+      <w:tr>
+        <w:tc>
+          <w:tcPr>
+            <w:tcW w:type="dxa" w:w="1440"/>
+          </w:tcPr>
+          <w:p>
+            <w:r>
+              <w:t>p_A</w:t>
+            </w:r>
+          </w:p>
+        </w:tc>
+        <w:tc>
+          <w:tcPr>
+            <w:tcW w:type="dxa" w:w="1440"/>
+          </w:tcPr>
+          <w:p>
+            <w:r>
+              <w:t>0.0727</w:t>
+            </w:r>
+          </w:p>
+        </w:tc>
+        <w:tc>
+          <w:tcPr>
+            <w:tcW w:type="dxa" w:w="1440"/>
+          </w:tcPr>
+          <w:p>
+            <w:r>
+              <w:t>0.0603</w:t>
+            </w:r>
+          </w:p>
+        </w:tc>
+        <w:tc>
+          <w:tcPr>
+            <w:tcW w:type="dxa" w:w="1440"/>
+          </w:tcPr>
+          <w:p>
+            <w:r>
+              <w:t>94.6%</w:t>
+            </w:r>
+          </w:p>
+        </w:tc>
+        <w:tc>
+          <w:tcPr>
+            <w:tcW w:type="dxa" w:w="1440"/>
+          </w:tcPr>
+          <w:p>
+            <w:r>
+              <w:t>0.0629</w:t>
+            </w:r>
+          </w:p>
+        </w:tc>
+        <w:tc>
+          <w:tcPr>
+            <w:tcW w:type="dxa" w:w="1440"/>
+          </w:tcPr>
+          <w:p>
+            <w:r>
+              <w:t>0.86</w:t>
+            </w:r>
+          </w:p>
+        </w:tc>
+      </w:tr>
+      <w:tr>
+        <w:tc>
+          <w:tcPr>
+            <w:tcW w:type="dxa" w:w="1440"/>
+          </w:tcPr>
+          <w:p>
+            <w:r>
+              <w:t>d</w:t>
+            </w:r>
+          </w:p>
+        </w:tc>
+        <w:tc>
+          <w:tcPr>
+            <w:tcW w:type="dxa" w:w="1440"/>
+          </w:tcPr>
+          <w:p>
+            <w:r>
+              <w:t>0.0000</w:t>
+            </w:r>
+          </w:p>
+        </w:tc>
+        <w:tc>
+          <w:tcPr>
+            <w:tcW w:type="dxa" w:w="1440"/>
+          </w:tcPr>
+          <w:p>
+            <w:r>
+              <w:t>0.0000</w:t>
+            </w:r>
+          </w:p>
+        </w:tc>
+        <w:tc>
+          <w:tcPr>
+            <w:tcW w:type="dxa" w:w="1440"/>
+          </w:tcPr>
+          <w:p>
+            <w:r>
+              <w:t>0.0%</w:t>
+            </w:r>
+          </w:p>
+        </w:tc>
+        <w:tc>
+          <w:tcPr>
+            <w:tcW w:type="dxa" w:w="1440"/>
+          </w:tcPr>
+          <w:p>
+            <w:r>
+              <w:t>0.0000</w:t>
+            </w:r>
+          </w:p>
+        </w:tc>
+        <w:tc>
+          <w:tcPr>
+            <w:tcW w:type="dxa" w:w="1440"/>
+          </w:tcPr>
+          <w:p>
+            <w:r>
+              <w:t>nan</w:t>
+            </w:r>
+          </w:p>
+        </w:tc>
+      </w:tr>
+    </w:tbl>
+    <w:p>
+      <w:pPr>
+        <w:pStyle w:val="Caption"/>
+        <w:jc w:val="center"/>
+      </w:pPr>
+      <w:r>
+        <w:t>Table 3. Rate-level projection accuracy, 2017-2023.</w:t>
+      </w:r>
+    </w:p>
+    <w:p>
+      <w:r>
+        <w:t>Overall rate-level RMSE = 0.0892, MAE = 0.0364, MAPE = 271.4%, skill = 0.99.</w:t>
+      </w:r>
+    </w:p>
+    <w:p>
+      <w:pPr>
+        <w:pStyle w:val="Heading1"/>
+      </w:pPr>
+      <w:r>
         <w:t>6. Validation and civilisational diversity</w:t>
       </w:r>
     </w:p>

</xml_diff>